<commit_message>
fix: subformulário inline do representante legal no wizard + RG condicional nos templates 03 e 04
No wizard, quando tem_representacao_legal está ativo, exibe campos de
nome completo (obrigatório), CPF (obrigatório com dígito verificador),
RG (opcional) e parentesco (select). O PATCH salva representante_legal
antes de avançar para Confirmação. Templates 03 e 04 agora suprimem a
linha de assinatura "RG:" quando o campo está vazio.

Co-Authored-By: Claude Sonnet 4.6 <noreply@anthropic.com>
</commit_message>
<xml_diff>
--- a/templates/03_contrato_bpc_menor_16.docx
+++ b/templates/03_contrato_bpc_menor_16.docx
@@ -3371,6 +3371,19 @@
     </w:p>
     <w:p>
       <w:pPr>
+        <w:spacing w:after="0"/>
+        <w:jc w:val="left"/>
+      </w:pPr>
+      <w:r>
+        <w:rPr>
+          <w:sz w:val="24"/>
+          <w:szCs w:val="24"/>
+        </w:rPr>
+        <w:t>{#representante.rg}</w:t>
+      </w:r>
+    </w:p>
+    <w:p>
+      <w:pPr>
         <w:spacing w:after="40"/>
         <w:jc w:val="left"/>
       </w:pPr>
@@ -3387,6 +3400,19 @@
           <w:szCs w:val="24"/>
         </w:rPr>
         <w:t xml:space="preserve">{representante.rg}</w:t>
+      </w:r>
+    </w:p>
+    <w:p>
+      <w:pPr>
+        <w:spacing w:after="0"/>
+        <w:jc w:val="left"/>
+      </w:pPr>
+      <w:r>
+        <w:rPr>
+          <w:sz w:val="24"/>
+          <w:szCs w:val="24"/>
+        </w:rPr>
+        <w:t>{/representante.rg}</w:t>
       </w:r>
     </w:p>
     <w:p>

</xml_diff>

<commit_message>
fix: RG do representante condicional no cabeçalho dos templates 03 e 04
Quando RG está vazio, o trecho ", RG: " some do parágrafo de qualificação
do contratante — sem vírgula solta. Com RG preenchido, aparece normalmente.

Co-Authored-By: Claude Sonnet 4.6 <noreply@anthropic.com>
</commit_message>
<xml_diff>
--- a/templates/03_contrato_bpc_menor_16.docx
+++ b/templates/03_contrato_bpc_menor_16.docx
@@ -785,6 +785,13 @@
           <w:sz w:val="24"/>
           <w:szCs w:val="24"/>
         </w:rPr>
+        <w:t>{#representante.rg}</w:t>
+      </w:r>
+      <w:r>
+        <w:rPr>
+          <w:sz w:val="24"/>
+          <w:szCs w:val="24"/>
+        </w:rPr>
         <w:t xml:space="preserve">, RG: </w:t>
       </w:r>
       <w:r>
@@ -793,6 +800,13 @@
           <w:szCs w:val="24"/>
         </w:rPr>
         <w:t xml:space="preserve">{representante.rg}</w:t>
+      </w:r>
+      <w:r>
+        <w:rPr>
+          <w:sz w:val="24"/>
+          <w:szCs w:val="24"/>
+        </w:rPr>
+        <w:t>{/representante.rg}</w:t>
       </w:r>
       <w:r>
         <w:rPr>

</xml_diff>